<commit_message>
Invoice pack: project documents (WOI uploaded once per project), PDF page identification with thumbnails and field extraction, uploaded SAP page and signed timesheets per invoice, one-click pack PDF; documents kept in IndexedDB and in backups
Co-Authored-By: Claude Fable 5.1 <noreply@anthropic.com>
Claude-Session: https://claude.ai/code/session_01FvztMCDJjkzUV6LkhkyE5H
</commit_message>
<xml_diff>
--- a/ls-attendance-tracker/docs/LS Attendance - Additional Application Requirements.docx
+++ b/ls-attendance-tracker/docs/LS Attendance - Additional Application Requirements.docx
@@ -7217,7 +7217,7 @@
                 <w:sz w:val="18"/>
                 <w:szCs w:val="18"/>
               </w:rPr>
-              <w:t xml:space="preserve">Leaflet · OpenStreetMap tiles · Esri World Imagery · Photon / Nominatim</w:t>
+              <w:t xml:space="preserve">Leaflet · Esri World Street Map · Esri World Imagery · Photon / Nominatim</w:t>
             </w:r>
           </w:p>
         </w:tc>
@@ -7303,7 +7303,7 @@
                 <w:sz w:val="18"/>
                 <w:szCs w:val="18"/>
               </w:rPr>
-              <w:t xml:space="preserve">SheetJS · ExcelJS · pdf-lib · qrcode-generator</w:t>
+              <w:t xml:space="preserve">SheetJS · ExcelJS · pdf-lib · pdf.js · html2canvas · qrcode-generator</w:t>
             </w:r>
           </w:p>
         </w:tc>
@@ -7331,7 +7331,7 @@
                 <w:sz w:val="18"/>
                 <w:szCs w:val="18"/>
               </w:rPr>
-              <w:t xml:space="preserve">0.18.5 · 4.4.0 · 1.17.1 · 1.4.4</w:t>
+              <w:t xml:space="preserve">0.18.5 · 4.4.0 · 1.17.1 · 4.10.38 · 1.4.1 · 1.4.4</w:t>
             </w:r>
           </w:p>
         </w:tc>

</xml_diff>